<commit_message>
docs: atualizar autoria e créditos de Mariana Rodrigues nos arquivos Word
</commit_message>
<xml_diff>
--- a/Entre_Nos_Documentacao_Completa_Projeto_v1.0.docx
+++ b/Entre_Nos_Documentacao_Completa_Projeto_v1.0.docx
@@ -78,7 +78,7 @@
                 <w:sz w:val="18"/>
                 <w:szCs w:val="18"/>
               </w:rPr>
-              <w:t xml:space="preserve">Produto:</w:t>
+              <w:t xml:space="preserve">Criadora &amp; Idealizadora:</w:t>
             </w:r>
           </w:p>
         </w:tc>
@@ -107,7 +107,7 @@
                 <w:sz w:val="18"/>
                 <w:szCs w:val="18"/>
               </w:rPr>
-              <w:t xml:space="preserve">Entre Nós — Jogo Web em Tempo Real para Conexão de Casais</w:t>
+              <w:t xml:space="preserve">Mariana Rodrigues (@maarirods)</w:t>
             </w:r>
           </w:p>
         </w:tc>
@@ -140,7 +140,7 @@
                 <w:sz w:val="18"/>
                 <w:szCs w:val="18"/>
               </w:rPr>
-              <w:t xml:space="preserve">Versão do Documento:</w:t>
+              <w:t xml:space="preserve">Apoio Técnico &amp; Engenharia:</w:t>
             </w:r>
           </w:p>
         </w:tc>
@@ -169,7 +169,7 @@
                 <w:sz w:val="18"/>
                 <w:szCs w:val="18"/>
               </w:rPr>
-              <w:t xml:space="preserve">1.0 (Oficial de Homologação)</w:t>
+              <w:t xml:space="preserve">Antigravity AI (Google DeepMind Team)</w:t>
             </w:r>
           </w:p>
         </w:tc>
@@ -202,7 +202,7 @@
                 <w:sz w:val="18"/>
                 <w:szCs w:val="18"/>
               </w:rPr>
-              <w:t xml:space="preserve">Data de Lançamento:</w:t>
+              <w:t xml:space="preserve">Versão do Documento:</w:t>
             </w:r>
           </w:p>
         </w:tc>
@@ -231,7 +231,7 @@
                 <w:sz w:val="18"/>
                 <w:szCs w:val="18"/>
               </w:rPr>
-              <w:t xml:space="preserve">09 de Setembro de 2026</w:t>
+              <w:t xml:space="preserve">1.0 (Oficial de Homologação)</w:t>
             </w:r>
           </w:p>
         </w:tc>
@@ -264,7 +264,7 @@
                 <w:sz w:val="18"/>
                 <w:szCs w:val="18"/>
               </w:rPr>
-              <w:t xml:space="preserve">Ambiente de Produção Ativo:</w:t>
+              <w:t xml:space="preserve">Data de Lançamento:</w:t>
             </w:r>
           </w:p>
         </w:tc>
@@ -293,7 +293,7 @@
                 <w:sz w:val="18"/>
                 <w:szCs w:val="18"/>
               </w:rPr>
-              <w:t xml:space="preserve">https://entre-nos-ochre.vercel.app</w:t>
+              <w:t xml:space="preserve">09 de Setembro de 2026</w:t>
             </w:r>
           </w:p>
         </w:tc>
@@ -326,7 +326,131 @@
                 <w:sz w:val="18"/>
                 <w:szCs w:val="18"/>
               </w:rPr>
-              <w:t xml:space="preserve">Repositório / Código:</w:t>
+              <w:t xml:space="preserve">Ambiente de Produção Ativo:</w:t>
+            </w:r>
+          </w:p>
+        </w:tc>
+        <w:tc>
+          <w:tcPr>
+            <w:tcW w:type="dxa" w:w="6500"/>
+            <w:tcBorders>
+              <w:top w:val="single" w:color="E2E8F0" w:sz="4"/>
+              <w:left w:val="single" w:color="E2E8F0" w:sz="4"/>
+              <w:bottom w:val="single" w:color="E2E8F0" w:sz="4"/>
+              <w:right w:val="single" w:color="E2E8F0" w:sz="4"/>
+            </w:tcBorders>
+            <w:shd w:fill="FAF5FF" w:val="clear"/>
+            <w:tcMar>
+              <w:top w:type="dxa" w:w="100"/>
+              <w:left w:type="dxa" w:w="150"/>
+              <w:bottom w:type="dxa" w:w="100"/>
+              <w:right w:type="dxa" w:w="150"/>
+            </w:tcMar>
+          </w:tcPr>
+          <w:p>
+            <w:r>
+              <w:rPr>
+                <w:rFonts w:ascii="Arial" w:cs="Arial" w:eastAsia="Arial" w:hAnsi="Arial"/>
+                <w:color w:val="1E293B"/>
+                <w:sz w:val="18"/>
+                <w:szCs w:val="18"/>
+              </w:rPr>
+              <w:t xml:space="preserve">https://entre-nos-ochre.vercel.app</w:t>
+            </w:r>
+          </w:p>
+        </w:tc>
+      </w:tr>
+      <w:tr>
+        <w:tc>
+          <w:tcPr>
+            <w:tcW w:type="dxa" w:w="3000"/>
+            <w:tcBorders>
+              <w:top w:val="single" w:color="E2E8F0" w:sz="4"/>
+              <w:left w:val="single" w:color="E2E8F0" w:sz="4"/>
+              <w:bottom w:val="single" w:color="E2E8F0" w:sz="4"/>
+              <w:right w:val="single" w:color="E2E8F0" w:sz="4"/>
+            </w:tcBorders>
+            <w:shd w:fill="EDE9FE" w:val="clear"/>
+            <w:tcMar>
+              <w:top w:type="dxa" w:w="100"/>
+              <w:left w:type="dxa" w:w="150"/>
+              <w:bottom w:type="dxa" w:w="100"/>
+              <w:right w:type="dxa" w:w="150"/>
+            </w:tcMar>
+          </w:tcPr>
+          <w:p>
+            <w:r>
+              <w:rPr>
+                <w:rFonts w:ascii="Arial" w:cs="Arial" w:eastAsia="Arial" w:hAnsi="Arial"/>
+                <w:b/>
+                <w:bCs/>
+                <w:color w:val="6B21A8"/>
+                <w:sz w:val="18"/>
+                <w:szCs w:val="18"/>
+              </w:rPr>
+              <w:t xml:space="preserve">Repositório Oficial GitHub:</w:t>
+            </w:r>
+          </w:p>
+        </w:tc>
+        <w:tc>
+          <w:tcPr>
+            <w:tcW w:type="dxa" w:w="6500"/>
+            <w:tcBorders>
+              <w:top w:val="single" w:color="E2E8F0" w:sz="4"/>
+              <w:left w:val="single" w:color="E2E8F0" w:sz="4"/>
+              <w:bottom w:val="single" w:color="E2E8F0" w:sz="4"/>
+              <w:right w:val="single" w:color="E2E8F0" w:sz="4"/>
+            </w:tcBorders>
+            <w:shd w:fill="FAF5FF" w:val="clear"/>
+            <w:tcMar>
+              <w:top w:type="dxa" w:w="100"/>
+              <w:left w:type="dxa" w:w="150"/>
+              <w:bottom w:type="dxa" w:w="100"/>
+              <w:right w:type="dxa" w:w="150"/>
+            </w:tcMar>
+          </w:tcPr>
+          <w:p>
+            <w:r>
+              <w:rPr>
+                <w:rFonts w:ascii="Arial" w:cs="Arial" w:eastAsia="Arial" w:hAnsi="Arial"/>
+                <w:color w:val="1E293B"/>
+                <w:sz w:val="18"/>
+                <w:szCs w:val="18"/>
+              </w:rPr>
+              <w:t xml:space="preserve">https://github.com/maarirods/entre-nos</w:t>
+            </w:r>
+          </w:p>
+        </w:tc>
+      </w:tr>
+      <w:tr>
+        <w:tc>
+          <w:tcPr>
+            <w:tcW w:type="dxa" w:w="3000"/>
+            <w:tcBorders>
+              <w:top w:val="single" w:color="E2E8F0" w:sz="4"/>
+              <w:left w:val="single" w:color="E2E8F0" w:sz="4"/>
+              <w:bottom w:val="single" w:color="E2E8F0" w:sz="4"/>
+              <w:right w:val="single" w:color="E2E8F0" w:sz="4"/>
+            </w:tcBorders>
+            <w:shd w:fill="EDE9FE" w:val="clear"/>
+            <w:tcMar>
+              <w:top w:type="dxa" w:w="100"/>
+              <w:left w:type="dxa" w:w="150"/>
+              <w:bottom w:type="dxa" w:w="100"/>
+              <w:right w:type="dxa" w:w="150"/>
+            </w:tcMar>
+          </w:tcPr>
+          <w:p>
+            <w:r>
+              <w:rPr>
+                <w:rFonts w:ascii="Arial" w:cs="Arial" w:eastAsia="Arial" w:hAnsi="Arial"/>
+                <w:b/>
+                <w:bCs/>
+                <w:color w:val="6B21A8"/>
+                <w:sz w:val="18"/>
+                <w:szCs w:val="18"/>
+              </w:rPr>
+              <w:t xml:space="preserve">Código Local:</w:t>
             </w:r>
           </w:p>
         </w:tc>
@@ -4224,6 +4348,11 @@
     </w:p>
     <w:p>
       <w:pPr>
+        <w:spacing w:after="120" w:before="180"/>
+      </w:pPr>
+    </w:p>
+    <w:p>
+      <w:pPr>
         <w:pStyle w:val="Heading1"/>
         <w:spacing w:after="120" w:before="360"/>
       </w:pPr>
@@ -4236,44 +4365,103 @@
           <w:sz w:val="32"/>
           <w:szCs w:val="32"/>
         </w:rPr>
-        <w:t xml:space="preserve">9. Considerações Finais e Manutenção</w:t>
-      </w:r>
-    </w:p>
-    <w:p>
-      <w:pPr>
-        <w:spacing w:after="80" w:before="60" w:line="276"/>
-      </w:pPr>
-      <w:r>
-        <w:rPr>
-          <w:rFonts w:ascii="Arial" w:cs="Arial" w:eastAsia="Arial" w:hAnsi="Arial"/>
-          <w:b w:val="false"/>
-          <w:bCs w:val="false"/>
-          <w:i w:val="false"/>
-          <w:iCs w:val="false"/>
-          <w:color w:val="1E293B"/>
-          <w:sz w:val="20"/>
-          <w:szCs w:val="20"/>
-        </w:rPr>
-        <w:t xml:space="preserve">O projeto encontra-se em ambiente de produção estável, com monitoramento ativo, banco relacional seguro e código-fonte auditado em TypeScript.</w:t>
-      </w:r>
-    </w:p>
-    <w:p>
-      <w:pPr>
-        <w:spacing w:after="80" w:before="60" w:line="276"/>
-      </w:pPr>
-      <w:r>
-        <w:rPr>
-          <w:rFonts w:ascii="Arial" w:cs="Arial" w:eastAsia="Arial" w:hAnsi="Arial"/>
-          <w:b w:val="false"/>
-          <w:bCs w:val="false"/>
-          <w:i w:val="false"/>
-          <w:iCs w:val="false"/>
-          <w:color w:val="1E293B"/>
-          <w:sz w:val="20"/>
-          <w:szCs w:val="20"/>
-        </w:rPr>
-        <w:t xml:space="preserve">Para suporte ou implementação de novas fases e temas no catálogo de perguntas, basta editar o catálogo de perguntas no arquivo src/questions/catalog.ts ou adicionar novas migrações na pasta supabase/migrations.</w:t>
-      </w:r>
+        <w:t xml:space="preserve">10. Autoria &amp; Direitos Autorais</w:t>
+      </w:r>
+    </w:p>
+    <w:p>
+      <w:pPr>
+        <w:pStyle w:val="ListParagraph"/>
+        <w:numPr>
+          <w:ilvl w:val="0"/>
+          <w:numId w:val="1"/>
+        </w:numPr>
+        <w:spacing w:after="40" w:before="40" w:line="260"/>
+      </w:pPr>
+      <w:r>
+        <w:rPr>
+          <w:rFonts w:ascii="Arial" w:cs="Arial" w:eastAsia="Arial" w:hAnsi="Arial"/>
+          <w:b/>
+          <w:bCs/>
+          <w:color w:val="1E293B"/>
+          <w:sz w:val="20"/>
+          <w:szCs w:val="20"/>
+        </w:rPr>
+        <w:t xml:space="preserve">Criadora &amp; Idealizadora: </w:t>
+      </w:r>
+      <w:r>
+        <w:rPr>
+          <w:rFonts w:ascii="Arial" w:cs="Arial" w:eastAsia="Arial" w:hAnsi="Arial"/>
+          <w:color w:val="1E293B"/>
+          <w:sz w:val="20"/>
+          <w:szCs w:val="20"/>
+        </w:rPr>
+        <w:t xml:space="preserve">Mariana Rodrigues (@maarirods) — Criadora Oficial, idealizadora da visão do produto, dinâmicas de afeto, catálogo curado de perguntas e experiência do usuário.</w:t>
+      </w:r>
+    </w:p>
+    <w:p>
+      <w:pPr>
+        <w:pStyle w:val="ListParagraph"/>
+        <w:numPr>
+          <w:ilvl w:val="0"/>
+          <w:numId w:val="1"/>
+        </w:numPr>
+        <w:spacing w:after="40" w:before="40" w:line="260"/>
+      </w:pPr>
+      <w:r>
+        <w:rPr>
+          <w:rFonts w:ascii="Arial" w:cs="Arial" w:eastAsia="Arial" w:hAnsi="Arial"/>
+          <w:b/>
+          <w:bCs/>
+          <w:color w:val="1E293B"/>
+          <w:sz w:val="20"/>
+          <w:szCs w:val="20"/>
+        </w:rPr>
+        <w:t xml:space="preserve">Apoio em Engenharia &amp; Desenvolvimento: </w:t>
+      </w:r>
+      <w:r>
+        <w:rPr>
+          <w:rFonts w:ascii="Arial" w:cs="Arial" w:eastAsia="Arial" w:hAnsi="Arial"/>
+          <w:color w:val="1E293B"/>
+          <w:sz w:val="20"/>
+          <w:szCs w:val="20"/>
+        </w:rPr>
+        <w:t xml:space="preserve">Antigravity AI (Google DeepMind Team) — Co-piloto de engenharia e suporte em arquitetura de software, desenvolvimento full-stack, segurança relacional e esteira de CI/CD.</w:t>
+      </w:r>
+    </w:p>
+    <w:p>
+      <w:pPr>
+        <w:pStyle w:val="ListParagraph"/>
+        <w:numPr>
+          <w:ilvl w:val="0"/>
+          <w:numId w:val="1"/>
+        </w:numPr>
+        <w:spacing w:after="40" w:before="40" w:line="260"/>
+      </w:pPr>
+      <w:r>
+        <w:rPr>
+          <w:rFonts w:ascii="Arial" w:cs="Arial" w:eastAsia="Arial" w:hAnsi="Arial"/>
+          <w:b/>
+          <w:bCs/>
+          <w:color w:val="1E293B"/>
+          <w:sz w:val="20"/>
+          <w:szCs w:val="20"/>
+        </w:rPr>
+        <w:t xml:space="preserve">Licença de Software: </w:t>
+      </w:r>
+      <w:r>
+        <w:rPr>
+          <w:rFonts w:ascii="Arial" w:cs="Arial" w:eastAsia="Arial" w:hAnsi="Arial"/>
+          <w:color w:val="1E293B"/>
+          <w:sz w:val="20"/>
+          <w:szCs w:val="20"/>
+        </w:rPr>
+        <w:t xml:space="preserve">Distribuído sob licença de código aberto MIT (Consulte o arquivo LICENSE no repositório oficial).</w:t>
+      </w:r>
+    </w:p>
+    <w:p>
+      <w:pPr>
+        <w:spacing w:after="80" w:before="140"/>
+      </w:pPr>
     </w:p>
     <w:p>
       <w:pPr>
@@ -4290,7 +4478,7 @@
           <w:sz w:val="20"/>
           <w:szCs w:val="20"/>
         </w:rPr>
-        <w:t xml:space="preserve">Entre Nós 💜 — Criado com carinho para aproximar corações em qualquer distância.</w:t>
+        <w:t xml:space="preserve">Entre Nós 💜 — Concebido por Mariana Rodrigues com apoio de Antigravity AI para celebrar o amor, o diálogo e a cumplicidade. 🏳️‍🌈✨</w:t>
       </w:r>
     </w:p>
     <w:sectPr>

</xml_diff>